<commit_message>
Update final project report
</commit_message>
<xml_diff>
--- a/report/Leaf_Disease_Spot_Segmentation_Report.docx
+++ b/report/Leaf_Disease_Spot_Segmentation_Report.docx
@@ -11,14 +11,74 @@
       <w:pPr>
         <w:spacing w:after="60" w:line="300" w:lineRule="auto"/>
         <w:jc w:val="center"/>
-      </w:pPr>
-      <w:r>
         <w:rPr>
           <w:b/>
           <w:bCs/>
           <w:sz w:val="26"/>
           <w:szCs w:val="26"/>
         </w:rPr>
+      </w:pPr>
+    </w:p>
+    <w:p>
+      <w:pPr>
+        <w:spacing w:after="60" w:line="300" w:lineRule="auto"/>
+        <w:jc w:val="center"/>
+        <w:rPr>
+          <w:b/>
+          <w:bCs/>
+          <w:sz w:val="26"/>
+          <w:szCs w:val="26"/>
+        </w:rPr>
+      </w:pPr>
+    </w:p>
+    <w:p>
+      <w:pPr>
+        <w:spacing w:after="60" w:line="300" w:lineRule="auto"/>
+        <w:jc w:val="center"/>
+        <w:rPr>
+          <w:b/>
+          <w:bCs/>
+          <w:sz w:val="26"/>
+          <w:szCs w:val="26"/>
+        </w:rPr>
+      </w:pPr>
+    </w:p>
+    <w:p>
+      <w:pPr>
+        <w:spacing w:after="60" w:line="300" w:lineRule="auto"/>
+        <w:jc w:val="center"/>
+        <w:rPr>
+          <w:b/>
+          <w:bCs/>
+          <w:sz w:val="26"/>
+          <w:szCs w:val="26"/>
+        </w:rPr>
+      </w:pPr>
+    </w:p>
+    <w:p>
+      <w:pPr>
+        <w:spacing w:after="60" w:line="300" w:lineRule="auto"/>
+        <w:jc w:val="center"/>
+        <w:rPr>
+          <w:b/>
+          <w:bCs/>
+          <w:sz w:val="26"/>
+          <w:szCs w:val="26"/>
+        </w:rPr>
+      </w:pPr>
+    </w:p>
+    <w:p>
+      <w:pPr>
+        <w:spacing w:after="60" w:line="300" w:lineRule="auto"/>
+        <w:jc w:val="center"/>
+      </w:pPr>
+      <w:r>
+        <w:rPr>
+          <w:b/>
+          <w:bCs/>
+          <w:sz w:val="26"/>
+          <w:szCs w:val="26"/>
+        </w:rPr>
         <w:t>MARIAN COLLEGE KUTTIKANAM (AUTONOMOUS)</w:t>
       </w:r>
     </w:p>
@@ -145,19 +205,6 @@
           <w:szCs w:val="24"/>
         </w:rPr>
         <w:t>Roll No.: 24UBC219</w:t>
-      </w:r>
-    </w:p>
-    <w:p>
-      <w:pPr>
-        <w:spacing w:line="300" w:lineRule="auto"/>
-        <w:jc w:val="center"/>
-      </w:pPr>
-      <w:r>
-        <w:rPr>
-          <w:sz w:val="24"/>
-          <w:szCs w:val="24"/>
-        </w:rPr>
-        <w:t>Academic Year 2026 – 2027</w:t>
       </w:r>
     </w:p>
     <w:p>
@@ -4933,15 +4980,21 @@
         </w:rPr>
         <w:t xml:space="preserve"> </w:t>
       </w:r>
-      <w:r>
-        <w:rPr>
-          <w:color w:val="0D0D0D" w:themeColor="text1" w:themeTint="F2"/>
-          <w:sz w:val="24"/>
-          <w:szCs w:val="24"/>
-        </w:rPr>
-        <w:t>https://github.com/Arppan-George-Biju/Leaf-Disease-Segmentation</w:t>
-      </w:r>
-      <w:r>
+      <w:hyperlink r:id="rId7" w:history="1">
+        <w:r>
+          <w:rPr>
+            <w:rStyle w:val="Hyperlink"/>
+            <w:sz w:val="24"/>
+            <w:szCs w:val="24"/>
+          </w:rPr>
+          <w:t>https://github.com/Arppan-George-Biju/Leaf-Disease-Segmentation</w:t>
+        </w:r>
+      </w:hyperlink>
+      <w:r>
+        <w:rPr>
+          <w:sz w:val="24"/>
+          <w:szCs w:val="24"/>
+        </w:rPr>
         <w:t xml:space="preserve"> </w:t>
       </w:r>
     </w:p>
@@ -5939,7 +5992,7 @@
                     <pic:cNvPicPr/>
                   </pic:nvPicPr>
                   <pic:blipFill>
-                    <a:blip r:embed="rId7"/>
+                    <a:blip r:embed="rId8"/>
                     <a:stretch>
                       <a:fillRect/>
                     </a:stretch>
@@ -6008,7 +6061,7 @@
                     <pic:cNvPicPr/>
                   </pic:nvPicPr>
                   <pic:blipFill>
-                    <a:blip r:embed="rId8"/>
+                    <a:blip r:embed="rId9"/>
                     <a:stretch>
                       <a:fillRect/>
                     </a:stretch>
@@ -6075,7 +6128,7 @@
                     <pic:cNvPicPr/>
                   </pic:nvPicPr>
                   <pic:blipFill>
-                    <a:blip r:embed="rId9"/>
+                    <a:blip r:embed="rId10"/>
                     <a:stretch>
                       <a:fillRect/>
                     </a:stretch>
@@ -6136,71 +6189,6 @@
                 <pic:pic xmlns:pic="http://schemas.openxmlformats.org/drawingml/2006/picture">
                   <pic:nvPicPr>
                     <pic:cNvPr id="789749148" name=""/>
-                    <pic:cNvPicPr/>
-                  </pic:nvPicPr>
-                  <pic:blipFill>
-                    <a:blip r:embed="rId10"/>
-                    <a:stretch>
-                      <a:fillRect/>
-                    </a:stretch>
-                  </pic:blipFill>
-                  <pic:spPr>
-                    <a:xfrm>
-                      <a:off x="0" y="0"/>
-                      <a:ext cx="5845810" cy="2023745"/>
-                    </a:xfrm>
-                    <a:prstGeom prst="rect">
-                      <a:avLst/>
-                    </a:prstGeom>
-                  </pic:spPr>
-                </pic:pic>
-              </a:graphicData>
-            </a:graphic>
-          </wp:inline>
-        </w:drawing>
-      </w:r>
-    </w:p>
-    <w:p>
-      <w:pPr>
-        <w:spacing w:after="60" w:line="300" w:lineRule="auto"/>
-        <w:jc w:val="both"/>
-      </w:pPr>
-      <w:r>
-        <w:rPr>
-          <w:sz w:val="24"/>
-          <w:szCs w:val="24"/>
-        </w:rPr>
-        <w:t>Figure 4 – Raw mask, mask after opening, and mask after closing.</w:t>
-      </w:r>
-    </w:p>
-    <w:p>
-      <w:pPr>
-        <w:spacing w:after="60" w:line="300" w:lineRule="auto"/>
-        <w:jc w:val="both"/>
-        <w:rPr>
-          <w:sz w:val="24"/>
-          <w:szCs w:val="24"/>
-        </w:rPr>
-      </w:pPr>
-      <w:r>
-        <w:rPr>
-          <w:sz w:val="24"/>
-          <w:szCs w:val="24"/>
-        </w:rPr>
-        <w:lastRenderedPageBreak/>
-        <w:drawing>
-          <wp:inline distT="0" distB="0" distL="0" distR="0" wp14:anchorId="05D6A6B6" wp14:editId="05148C91">
-            <wp:extent cx="5845810" cy="2023745"/>
-            <wp:effectExtent l="0" t="0" r="2540" b="0"/>
-            <wp:docPr id="1663855166" name="Picture 1"/>
-            <wp:cNvGraphicFramePr>
-              <a:graphicFrameLocks xmlns:a="http://schemas.openxmlformats.org/drawingml/2006/main" noChangeAspect="1"/>
-            </wp:cNvGraphicFramePr>
-            <a:graphic xmlns:a="http://schemas.openxmlformats.org/drawingml/2006/main">
-              <a:graphicData uri="http://schemas.openxmlformats.org/drawingml/2006/picture">
-                <pic:pic xmlns:pic="http://schemas.openxmlformats.org/drawingml/2006/picture">
-                  <pic:nvPicPr>
-                    <pic:cNvPr id="1663855166" name=""/>
                     <pic:cNvPicPr/>
                   </pic:nvPicPr>
                   <pic:blipFill>
@@ -6235,6 +6223,71 @@
           <w:sz w:val="24"/>
           <w:szCs w:val="24"/>
         </w:rPr>
+        <w:t>Figure 4 – Raw mask, mask after opening, and mask after closing.</w:t>
+      </w:r>
+    </w:p>
+    <w:p>
+      <w:pPr>
+        <w:spacing w:after="60" w:line="300" w:lineRule="auto"/>
+        <w:jc w:val="both"/>
+        <w:rPr>
+          <w:sz w:val="24"/>
+          <w:szCs w:val="24"/>
+        </w:rPr>
+      </w:pPr>
+      <w:r>
+        <w:rPr>
+          <w:sz w:val="24"/>
+          <w:szCs w:val="24"/>
+        </w:rPr>
+        <w:lastRenderedPageBreak/>
+        <w:drawing>
+          <wp:inline distT="0" distB="0" distL="0" distR="0" wp14:anchorId="05D6A6B6" wp14:editId="05148C91">
+            <wp:extent cx="5845810" cy="2023745"/>
+            <wp:effectExtent l="0" t="0" r="2540" b="0"/>
+            <wp:docPr id="1663855166" name="Picture 1"/>
+            <wp:cNvGraphicFramePr>
+              <a:graphicFrameLocks xmlns:a="http://schemas.openxmlformats.org/drawingml/2006/main" noChangeAspect="1"/>
+            </wp:cNvGraphicFramePr>
+            <a:graphic xmlns:a="http://schemas.openxmlformats.org/drawingml/2006/main">
+              <a:graphicData uri="http://schemas.openxmlformats.org/drawingml/2006/picture">
+                <pic:pic xmlns:pic="http://schemas.openxmlformats.org/drawingml/2006/picture">
+                  <pic:nvPicPr>
+                    <pic:cNvPr id="1663855166" name=""/>
+                    <pic:cNvPicPr/>
+                  </pic:nvPicPr>
+                  <pic:blipFill>
+                    <a:blip r:embed="rId12"/>
+                    <a:stretch>
+                      <a:fillRect/>
+                    </a:stretch>
+                  </pic:blipFill>
+                  <pic:spPr>
+                    <a:xfrm>
+                      <a:off x="0" y="0"/>
+                      <a:ext cx="5845810" cy="2023745"/>
+                    </a:xfrm>
+                    <a:prstGeom prst="rect">
+                      <a:avLst/>
+                    </a:prstGeom>
+                  </pic:spPr>
+                </pic:pic>
+              </a:graphicData>
+            </a:graphic>
+          </wp:inline>
+        </w:drawing>
+      </w:r>
+    </w:p>
+    <w:p>
+      <w:pPr>
+        <w:spacing w:after="60" w:line="300" w:lineRule="auto"/>
+        <w:jc w:val="both"/>
+      </w:pPr>
+      <w:r>
+        <w:rPr>
+          <w:sz w:val="24"/>
+          <w:szCs w:val="24"/>
+        </w:rPr>
         <w:t>Figure 5 – Original, final mask and segmented output for a single image.</w:t>
       </w:r>
     </w:p>
@@ -6268,7 +6321,7 @@
                     <pic:cNvPicPr/>
                   </pic:nvPicPr>
                   <pic:blipFill>
-                    <a:blip r:embed="rId12"/>
+                    <a:blip r:embed="rId13"/>
                     <a:stretch>
                       <a:fillRect/>
                     </a:stretch>
@@ -6309,7 +6362,7 @@
                     <pic:cNvPicPr/>
                   </pic:nvPicPr>
                   <pic:blipFill>
-                    <a:blip r:embed="rId13"/>
+                    <a:blip r:embed="rId14"/>
                     <a:stretch>
                       <a:fillRect/>
                     </a:stretch>
@@ -6383,7 +6436,7 @@
                     <pic:cNvPicPr/>
                   </pic:nvPicPr>
                   <pic:blipFill>
-                    <a:blip r:embed="rId14"/>
+                    <a:blip r:embed="rId15"/>
                     <a:stretch>
                       <a:fillRect/>
                     </a:stretch>
@@ -6457,7 +6510,7 @@
                     <pic:cNvPicPr/>
                   </pic:nvPicPr>
                   <pic:blipFill>
-                    <a:blip r:embed="rId15"/>
+                    <a:blip r:embed="rId16"/>
                     <a:stretch>
                       <a:fillRect/>
                     </a:stretch>
@@ -6570,7 +6623,7 @@
                     <pic:cNvPicPr/>
                   </pic:nvPicPr>
                   <pic:blipFill>
-                    <a:blip r:embed="rId16"/>
+                    <a:blip r:embed="rId17"/>
                     <a:stretch>
                       <a:fillRect/>
                     </a:stretch>
@@ -6605,7 +6658,7 @@
       </w:r>
     </w:p>
     <w:sectPr>
-      <w:footerReference w:type="default" r:id="rId17"/>
+      <w:footerReference w:type="default" r:id="rId18"/>
       <w:pgSz w:w="11906" w:h="16838"/>
       <w:pgMar w:top="1440" w:right="1260" w:bottom="1440" w:left="1440" w:header="708" w:footer="708" w:gutter="0"/>
       <w:cols w:space="720"/>

</xml_diff>